<commit_message>
new reference & Update
</commit_message>
<xml_diff>
--- a/MalwarePEDetection/TechnicalReports/kaggle小数据集实验结果.docx
+++ b/MalwarePEDetection/TechnicalReports/kaggle小数据集实验结果.docx
@@ -5,7 +5,6 @@
     <w:p>
       <w:pPr>
         <w:rPr>
-          <w:rFonts w:hint="eastAsia"/>
           <w:b/>
           <w:sz w:val="24"/>
           <w:szCs w:val="24"/>
@@ -31,11 +30,6 @@
       </w:r>
     </w:p>
     <w:p>
-      <w:pPr>
-        <w:rPr>
-          <w:rFonts w:hint="eastAsia"/>
-        </w:rPr>
-      </w:pPr>
       <w:r>
         <w:rPr>
           <w:rFonts w:hint="eastAsia"/>
@@ -130,11 +124,6 @@
       </w:r>
     </w:p>
     <w:p>
-      <w:pPr>
-        <w:rPr>
-          <w:rFonts w:hint="eastAsia"/>
-        </w:rPr>
-      </w:pPr>
       <w:r>
         <w:rPr>
           <w:rFonts w:hint="eastAsia"/>
@@ -241,11 +230,6 @@
       </w:r>
     </w:p>
     <w:p>
-      <w:pPr>
-        <w:rPr>
-          <w:rFonts w:hint="eastAsia"/>
-        </w:rPr>
-      </w:pPr>
       <w:r>
         <w:rPr>
           <w:rFonts w:hint="eastAsia"/>
@@ -265,17 +249,10 @@
         <w:t>20M</w:t>
       </w:r>
     </w:p>
+    <w:p/>
     <w:p>
       <w:pPr>
         <w:rPr>
-          <w:rFonts w:hint="eastAsia"/>
-        </w:rPr>
-      </w:pPr>
-    </w:p>
-    <w:p>
-      <w:pPr>
-        <w:rPr>
-          <w:rFonts w:hint="eastAsia"/>
           <w:b/>
           <w:sz w:val="24"/>
           <w:szCs w:val="24"/>
@@ -463,11 +440,6 @@
             <w:tcW w:w="1667" w:type="pct"/>
           </w:tcPr>
           <w:p>
-            <w:pPr>
-              <w:rPr>
-                <w:rFonts w:hint="eastAsia"/>
-              </w:rPr>
-            </w:pPr>
             <w:r>
               <w:t>此处选择了</w:t>
             </w:r>
@@ -654,11 +626,6 @@
             <w:tcW w:w="1666" w:type="pct"/>
           </w:tcPr>
           <w:p>
-            <w:pPr>
-              <w:rPr>
-                <w:rFonts w:hint="eastAsia"/>
-              </w:rPr>
-            </w:pPr>
             <w:r>
               <w:rPr>
                 <w:rFonts w:hint="eastAsia"/>
@@ -724,11 +691,6 @@
             <w:tcW w:w="1666" w:type="pct"/>
           </w:tcPr>
           <w:p>
-            <w:pPr>
-              <w:rPr>
-                <w:rFonts w:hint="eastAsia"/>
-              </w:rPr>
-            </w:pPr>
             <w:r>
               <w:rPr>
                 <w:rFonts w:hint="eastAsia"/>
@@ -812,11 +774,6 @@
             <w:tcW w:w="1666" w:type="pct"/>
           </w:tcPr>
           <w:p>
-            <w:pPr>
-              <w:rPr>
-                <w:rFonts w:hint="eastAsia"/>
-              </w:rPr>
-            </w:pPr>
             <w:r>
               <w:rPr>
                 <w:rFonts w:hint="eastAsia"/>
@@ -927,11 +884,6 @@
             <w:tcW w:w="1667" w:type="pct"/>
           </w:tcPr>
           <w:p>
-            <w:pPr>
-              <w:rPr>
-                <w:rFonts w:hint="eastAsia"/>
-              </w:rPr>
-            </w:pPr>
             <w:r>
               <w:rPr>
                 <w:rFonts w:hint="eastAsia"/>
@@ -1021,11 +973,6 @@
             <w:tcW w:w="1666" w:type="pct"/>
           </w:tcPr>
           <w:p>
-            <w:pPr>
-              <w:rPr>
-                <w:rFonts w:hint="eastAsia"/>
-              </w:rPr>
-            </w:pPr>
             <w:r>
               <w:rPr>
                 <w:rFonts w:hint="eastAsia"/>
@@ -1071,7 +1018,6 @@
     <w:p>
       <w:pPr>
         <w:rPr>
-          <w:rFonts w:hint="eastAsia"/>
           <w:b/>
           <w:sz w:val="24"/>
           <w:szCs w:val="24"/>
@@ -1081,7 +1027,6 @@
     <w:p>
       <w:pPr>
         <w:rPr>
-          <w:rFonts w:hint="eastAsia"/>
           <w:b/>
           <w:sz w:val="24"/>
           <w:szCs w:val="24"/>
@@ -1107,11 +1052,6 @@
       </w:r>
     </w:p>
     <w:p>
-      <w:pPr>
-        <w:rPr>
-          <w:rFonts w:hint="eastAsia"/>
-        </w:rPr>
-      </w:pPr>
       <w:r>
         <w:rPr>
           <w:rFonts w:hint="eastAsia"/>
@@ -1150,11 +1090,6 @@
       </w:r>
     </w:p>
     <w:p>
-      <w:pPr>
-        <w:rPr>
-          <w:rFonts w:hint="eastAsia"/>
-        </w:rPr>
-      </w:pPr>
       <w:r>
         <w:rPr>
           <w:rFonts w:hint="eastAsia"/>
@@ -1192,17 +1127,10 @@
         <w:t>500</w:t>
       </w:r>
     </w:p>
+    <w:p/>
     <w:p>
       <w:pPr>
         <w:rPr>
-          <w:rFonts w:hint="eastAsia"/>
-        </w:rPr>
-      </w:pPr>
-    </w:p>
-    <w:p>
-      <w:pPr>
-        <w:rPr>
-          <w:rFonts w:hint="eastAsia"/>
           <w:b/>
           <w:sz w:val="24"/>
           <w:szCs w:val="24"/>
@@ -1238,9 +1166,6 @@
           <w:p>
             <w:pPr>
               <w:jc w:val="center"/>
-              <w:rPr>
-                <w:rFonts w:hint="eastAsia"/>
-              </w:rPr>
             </w:pPr>
             <w:r>
               <w:rPr>
@@ -1258,9 +1183,6 @@
           <w:p>
             <w:pPr>
               <w:jc w:val="center"/>
-              <w:rPr>
-                <w:rFonts w:hint="eastAsia"/>
-              </w:rPr>
             </w:pPr>
             <w:r>
               <w:rPr>
@@ -1278,9 +1200,6 @@
           <w:p>
             <w:pPr>
               <w:jc w:val="center"/>
-              <w:rPr>
-                <w:rFonts w:hint="eastAsia"/>
-              </w:rPr>
             </w:pPr>
             <w:r>
               <w:t>A</w:t>
@@ -1301,9 +1220,6 @@
           <w:p>
             <w:pPr>
               <w:jc w:val="center"/>
-              <w:rPr>
-                <w:rFonts w:hint="eastAsia"/>
-              </w:rPr>
             </w:pPr>
             <w:r>
               <w:t>T</w:t>
@@ -1351,9 +1267,6 @@
           <w:p>
             <w:pPr>
               <w:jc w:val="center"/>
-              <w:rPr>
-                <w:rFonts w:hint="eastAsia"/>
-              </w:rPr>
             </w:pPr>
             <w:r>
               <w:t>O</w:t>
@@ -1374,9 +1287,6 @@
           <w:p>
             <w:pPr>
               <w:jc w:val="center"/>
-              <w:rPr>
-                <w:rFonts w:hint="eastAsia"/>
-              </w:rPr>
             </w:pPr>
             <w:r>
               <w:t>99.30%</w:t>
@@ -1391,9 +1301,6 @@
           <w:p>
             <w:pPr>
               <w:jc w:val="center"/>
-              <w:rPr>
-                <w:rFonts w:hint="eastAsia"/>
-              </w:rPr>
             </w:pPr>
             <w:r>
               <w:t>{'&lt;50': 3, '&lt;60': 4, '&lt;70': 14, '&lt;80': 14, '&lt;90': 33, '&lt;=100': 497}</w:t>
@@ -1409,9 +1316,6 @@
           <w:p>
             <w:pPr>
               <w:jc w:val="center"/>
-              <w:rPr>
-                <w:rFonts w:hint="eastAsia"/>
-              </w:rPr>
             </w:pPr>
             <w:r>
               <w:rPr>
@@ -1449,9 +1353,6 @@
           <w:p>
             <w:pPr>
               <w:jc w:val="center"/>
-              <w:rPr>
-                <w:rFonts w:hint="eastAsia"/>
-              </w:rPr>
             </w:pPr>
             <w:r>
               <w:t>99.12%</w:t>
@@ -1481,9 +1382,6 @@
           <w:p>
             <w:pPr>
               <w:jc w:val="center"/>
-              <w:rPr>
-                <w:rFonts w:hint="eastAsia"/>
-              </w:rPr>
             </w:pPr>
             <w:r>
               <w:rPr>
@@ -1502,9 +1400,6 @@
           <w:p>
             <w:pPr>
               <w:jc w:val="center"/>
-              <w:rPr>
-                <w:rFonts w:hint="eastAsia"/>
-              </w:rPr>
             </w:pPr>
             <w:r>
               <w:rPr>
@@ -1522,9 +1417,6 @@
           <w:p>
             <w:pPr>
               <w:jc w:val="center"/>
-              <w:rPr>
-                <w:rFonts w:hint="eastAsia"/>
-              </w:rPr>
             </w:pPr>
             <w:r>
               <w:t>94.55%</w:t>
@@ -1539,10 +1431,10 @@
           <w:p>
             <w:pPr>
               <w:jc w:val="center"/>
-              <w:rPr>
-                <w:rFonts w:hint="eastAsia"/>
-              </w:rPr>
-            </w:pPr>
+            </w:pPr>
+            <w:r>
+              <w:t>{'&lt;50': 0, '&lt;60': 0, '&lt;70': 25, '&lt;80': 0, '&lt;90': 20, '&lt;=100': 493}</w:t>
+            </w:r>
           </w:p>
         </w:tc>
       </w:tr>
@@ -1554,9 +1446,6 @@
           <w:p>
             <w:pPr>
               <w:jc w:val="center"/>
-              <w:rPr>
-                <w:rFonts w:hint="eastAsia"/>
-              </w:rPr>
             </w:pPr>
             <w:r>
               <w:rPr>
@@ -1574,9 +1463,6 @@
           <w:p>
             <w:pPr>
               <w:jc w:val="center"/>
-              <w:rPr>
-                <w:rFonts w:hint="eastAsia"/>
-              </w:rPr>
             </w:pPr>
             <w:r>
               <w:rPr>
@@ -1594,10 +1480,10 @@
           <w:p>
             <w:pPr>
               <w:jc w:val="center"/>
-              <w:rPr>
-                <w:rFonts w:hint="eastAsia"/>
-              </w:rPr>
-            </w:pPr>
+            </w:pPr>
+            <w:r>
+              <w:t>98.59%</w:t>
+            </w:r>
           </w:p>
         </w:tc>
         <w:tc>
@@ -1608,10 +1494,10 @@
           <w:p>
             <w:pPr>
               <w:jc w:val="center"/>
-              <w:rPr>
-                <w:rFonts w:hint="eastAsia"/>
-              </w:rPr>
-            </w:pPr>
+            </w:pPr>
+            <w:r>
+              <w:t>{'&lt;50': 1, '&lt;60': 9, '&lt;70': 14, '&lt;80': 28, '&lt;90': 42, '&lt;=100': 467}</w:t>
+            </w:r>
           </w:p>
         </w:tc>
       </w:tr>
@@ -1623,9 +1509,6 @@
           <w:p>
             <w:pPr>
               <w:jc w:val="center"/>
-              <w:rPr>
-                <w:rFonts w:hint="eastAsia"/>
-              </w:rPr>
             </w:pPr>
             <w:r>
               <w:rPr>
@@ -1643,9 +1526,6 @@
           <w:p>
             <w:pPr>
               <w:jc w:val="center"/>
-              <w:rPr>
-                <w:rFonts w:hint="eastAsia"/>
-              </w:rPr>
             </w:pPr>
             <w:r>
               <w:rPr>
@@ -1663,9 +1543,6 @@
           <w:p>
             <w:pPr>
               <w:jc w:val="center"/>
-              <w:rPr>
-                <w:rFonts w:hint="eastAsia"/>
-              </w:rPr>
             </w:pPr>
             <w:r>
               <w:t>98.77%</w:t>
@@ -1680,9 +1557,6 @@
           <w:p>
             <w:pPr>
               <w:jc w:val="center"/>
-              <w:rPr>
-                <w:rFonts w:hint="eastAsia"/>
-              </w:rPr>
             </w:pPr>
             <w:r>
               <w:t>{'&lt;50': 7, '&lt;60': 2, '&lt;70': 1, '&lt;80': 8, '&lt;90': 34, '&lt;=100': 510}</w:t>
@@ -1698,9 +1572,6 @@
           <w:p>
             <w:pPr>
               <w:jc w:val="center"/>
-              <w:rPr>
-                <w:rFonts w:hint="eastAsia"/>
-              </w:rPr>
             </w:pPr>
             <w:r>
               <w:rPr>
@@ -1718,9 +1589,6 @@
           <w:p>
             <w:pPr>
               <w:jc w:val="center"/>
-              <w:rPr>
-                <w:rFonts w:hint="eastAsia"/>
-              </w:rPr>
             </w:pPr>
             <w:r>
               <w:rPr>
@@ -1738,9 +1606,6 @@
           <w:p>
             <w:pPr>
               <w:jc w:val="center"/>
-              <w:rPr>
-                <w:rFonts w:hint="eastAsia"/>
-              </w:rPr>
             </w:pPr>
             <w:r>
               <w:t>99.12%</w:t>
@@ -1755,9 +1620,6 @@
           <w:p>
             <w:pPr>
               <w:jc w:val="center"/>
-              <w:rPr>
-                <w:rFonts w:hint="eastAsia"/>
-              </w:rPr>
             </w:pPr>
             <w:r>
               <w:t>{'&lt;50': 1, '&lt;60': 1, '&lt;70': 7, '&lt;80': 5, '&lt;90': 22, '&lt;=100': 528}</w:t>
@@ -1790,9 +1652,6 @@
           <w:p>
             <w:pPr>
               <w:jc w:val="center"/>
-              <w:rPr>
-                <w:rFonts w:hint="eastAsia"/>
-              </w:rPr>
             </w:pPr>
             <w:r>
               <w:t>Instruction</w:t>
@@ -1813,9 +1672,6 @@
           <w:p>
             <w:pPr>
               <w:jc w:val="center"/>
-              <w:rPr>
-                <w:rFonts w:hint="eastAsia"/>
-              </w:rPr>
             </w:pPr>
             <w:r>
               <w:t>61.86%</w:t>
@@ -1830,9 +1686,6 @@
           <w:p>
             <w:pPr>
               <w:jc w:val="center"/>
-              <w:rPr>
-                <w:rFonts w:hint="eastAsia"/>
-              </w:rPr>
             </w:pPr>
             <w:r>
               <w:t>{'&lt;50': 198, '&lt;60': 15, '&lt;70': 128, '&lt;80': 11, '&lt;90': 0, '&lt;=100': 0}</w:t>
@@ -1848,9 +1701,6 @@
           <w:p>
             <w:pPr>
               <w:jc w:val="center"/>
-              <w:rPr>
-                <w:rFonts w:hint="eastAsia"/>
-              </w:rPr>
             </w:pPr>
             <w:r>
               <w:rPr>
@@ -1868,9 +1718,6 @@
           <w:p>
             <w:pPr>
               <w:jc w:val="center"/>
-              <w:rPr>
-                <w:rFonts w:hint="eastAsia"/>
-              </w:rPr>
             </w:pPr>
             <w:r>
               <w:rPr>
@@ -1906,9 +1753,6 @@
           <w:p>
             <w:pPr>
               <w:jc w:val="center"/>
-              <w:rPr>
-                <w:rFonts w:hint="eastAsia"/>
-              </w:rPr>
             </w:pPr>
             <w:r>
               <w:t>94.55%</w:t>
@@ -1923,9 +1767,6 @@
           <w:p>
             <w:pPr>
               <w:jc w:val="center"/>
-              <w:rPr>
-                <w:rFonts w:hint="eastAsia"/>
-              </w:rPr>
             </w:pPr>
             <w:r>
               <w:t>{'&lt;50': 1, '&lt;60': 28, '&lt;70': 6, '&lt;80': 12, '&lt;90': 54, '&lt;=100': 437}</w:t>
@@ -1941,9 +1782,6 @@
           <w:p>
             <w:pPr>
               <w:jc w:val="center"/>
-              <w:rPr>
-                <w:rFonts w:hint="eastAsia"/>
-              </w:rPr>
             </w:pPr>
             <w:r>
               <w:rPr>
@@ -1961,9 +1799,6 @@
           <w:p>
             <w:pPr>
               <w:jc w:val="center"/>
-              <w:rPr>
-                <w:rFonts w:hint="eastAsia"/>
-              </w:rPr>
             </w:pPr>
             <w:r>
               <w:t>O</w:t>
@@ -1993,9 +1828,6 @@
           <w:p>
             <w:pPr>
               <w:jc w:val="center"/>
-              <w:rPr>
-                <w:rFonts w:hint="eastAsia"/>
-              </w:rPr>
             </w:pPr>
             <w:r>
               <w:t>99.47%</w:t>
@@ -2010,9 +1842,6 @@
           <w:p>
             <w:pPr>
               <w:jc w:val="center"/>
-              <w:rPr>
-                <w:rFonts w:hint="eastAsia"/>
-              </w:rPr>
             </w:pPr>
             <w:r>
               <w:t>{'&lt;50': 0, '&lt;60': 1, '&lt;70': 5, '&lt;80': 2, '&lt;90': 4, '&lt;=100': 554}</w:t>
@@ -2028,9 +1857,6 @@
           <w:p>
             <w:pPr>
               <w:jc w:val="center"/>
-              <w:rPr>
-                <w:rFonts w:hint="eastAsia"/>
-              </w:rPr>
             </w:pPr>
             <w:r>
               <w:rPr>
@@ -2048,9 +1874,6 @@
           <w:p>
             <w:pPr>
               <w:jc w:val="center"/>
-              <w:rPr>
-                <w:rFonts w:hint="eastAsia"/>
-              </w:rPr>
             </w:pPr>
             <w:r>
               <w:t>A</w:t>
@@ -2071,9 +1894,6 @@
           <w:p>
             <w:pPr>
               <w:jc w:val="center"/>
-              <w:rPr>
-                <w:rFonts w:hint="eastAsia"/>
-              </w:rPr>
             </w:pPr>
             <w:r>
               <w:t>99.47%</w:t>
@@ -2088,9 +1908,6 @@
           <w:p>
             <w:pPr>
               <w:jc w:val="center"/>
-              <w:rPr>
-                <w:rFonts w:hint="eastAsia"/>
-              </w:rPr>
             </w:pPr>
             <w:r>
               <w:t>{'&lt;50': 0, '&lt;60': 0, '&lt;70': 3, '&lt;80': 0, '&lt;90': 0, '&lt;=100': 563}</w:t>
@@ -2099,17 +1916,10 @@
         </w:tc>
       </w:tr>
     </w:tbl>
+    <w:p/>
     <w:p>
       <w:pPr>
         <w:rPr>
-          <w:rFonts w:hint="eastAsia"/>
-        </w:rPr>
-      </w:pPr>
-    </w:p>
-    <w:p>
-      <w:pPr>
-        <w:rPr>
-          <w:rFonts w:hint="eastAsia"/>
           <w:b/>
           <w:sz w:val="24"/>
           <w:szCs w:val="24"/>
@@ -2126,11 +1936,6 @@
       </w:r>
     </w:p>
     <w:p>
-      <w:pPr>
-        <w:rPr>
-          <w:rFonts w:hint="eastAsia"/>
-        </w:rPr>
-      </w:pPr>
       <w:r>
         <w:rPr>
           <w:rFonts w:hint="eastAsia"/>
@@ -2217,11 +2022,6 @@
       </w:r>
     </w:p>
     <w:p>
-      <w:pPr>
-        <w:rPr>
-          <w:rFonts w:hint="eastAsia"/>
-        </w:rPr>
-      </w:pPr>
       <w:r>
         <w:rPr>
           <w:rFonts w:hint="eastAsia"/>
@@ -2236,11 +2036,6 @@
       </w:r>
     </w:p>
     <w:p>
-      <w:pPr>
-        <w:rPr>
-          <w:rFonts w:hint="eastAsia"/>
-        </w:rPr>
-      </w:pPr>
       <w:r>
         <w:rPr>
           <w:rFonts w:hint="eastAsia"/>
@@ -2255,11 +2050,6 @@
       </w:r>
     </w:p>
     <w:p>
-      <w:pPr>
-        <w:rPr>
-          <w:rFonts w:hint="eastAsia"/>
-        </w:rPr>
-      </w:pPr>
       <w:r>
         <w:rPr>
           <w:rFonts w:hint="eastAsia"/>
@@ -2345,9 +2135,6 @@
           <w:p>
             <w:pPr>
               <w:jc w:val="center"/>
-              <w:rPr>
-                <w:rFonts w:hint="eastAsia"/>
-              </w:rPr>
             </w:pPr>
             <w:r>
               <w:rPr>
@@ -2557,9 +2344,6 @@
           <w:p>
             <w:pPr>
               <w:jc w:val="center"/>
-              <w:rPr>
-                <w:rFonts w:hint="eastAsia"/>
-              </w:rPr>
             </w:pPr>
             <w:r>
               <w:rPr>
@@ -2601,9 +2385,6 @@
           <w:p>
             <w:pPr>
               <w:jc w:val="center"/>
-              <w:rPr>
-                <w:rFonts w:hint="eastAsia"/>
-              </w:rPr>
             </w:pPr>
             <w:r>
               <w:rPr>
@@ -2648,9 +2429,6 @@
           <w:p>
             <w:pPr>
               <w:jc w:val="center"/>
-              <w:rPr>
-                <w:rFonts w:hint="eastAsia"/>
-              </w:rPr>
             </w:pPr>
             <w:r>
               <w:rPr>
@@ -2731,9 +2509,6 @@
           <w:p>
             <w:pPr>
               <w:jc w:val="center"/>
-              <w:rPr>
-                <w:rFonts w:hint="eastAsia"/>
-              </w:rPr>
             </w:pPr>
             <w:r>
               <w:rPr>
@@ -2778,9 +2553,6 @@
           <w:p>
             <w:pPr>
               <w:jc w:val="center"/>
-              <w:rPr>
-                <w:rFonts w:hint="eastAsia"/>
-              </w:rPr>
             </w:pPr>
             <w:r>
               <w:rPr>
@@ -3034,6 +2806,7 @@
   <w:style w:type="paragraph" w:default="1" w:styleId="a">
     <w:name w:val="Normal"/>
     <w:qFormat/>
+    <w:rsid w:val="00B90749"/>
     <w:pPr>
       <w:widowControl w:val="0"/>
       <w:jc w:val="both"/>

</xml_diff>